<commit_message>
Improve final report generation and polishing workflow
</commit_message>
<xml_diff>
--- a/SmartAnalyst/templates/report_template.docx
+++ b/SmartAnalyst/templates/report_template.docx
@@ -253,17 +253,10 @@
           <w:sz w:val="28"/>
           <w:szCs w:val="28"/>
         </w:rPr>
-        <w:t>Tittle</w:t>
-      </w:r>
-      <w:r>
-        <w:rPr>
-          <w:rFonts w:ascii="Arial" w:hAnsi="Arial" w:eastAsia="Arial" w:cs="Arial"/>
-          <w:spacing w:val="-14"/>
-          <w:sz w:val="28"/>
-          <w:szCs w:val="28"/>
-        </w:rPr>
-        <w:t xml:space="preserve"> </w:t>
-      </w:r>
+        <w:t>Tit</w:t>
+      </w:r>
+      <w:bookmarkStart w:id="0" w:name="_GoBack"/>
+      <w:bookmarkEnd w:id="0"/>
       <w:r>
         <w:rPr>
           <w:rFonts w:ascii="Arial" w:hAnsi="Arial" w:eastAsia="Arial" w:cs="Arial"/>
@@ -273,12 +266,12 @@
           <w:sz w:val="28"/>
           <w:szCs w:val="28"/>
         </w:rPr>
-        <w:t>in</w:t>
+        <w:t>le</w:t>
       </w:r>
       <w:r>
         <w:rPr>
           <w:rFonts w:ascii="Arial" w:hAnsi="Arial" w:eastAsia="Arial" w:cs="Arial"/>
-          <w:spacing w:val="-12"/>
+          <w:spacing w:val="-14"/>
           <w:sz w:val="28"/>
           <w:szCs w:val="28"/>
         </w:rPr>
@@ -293,13 +286,30 @@
           <w:sz w:val="28"/>
           <w:szCs w:val="28"/>
         </w:rPr>
+        <w:t>in</w:t>
+      </w:r>
+      <w:r>
+        <w:rPr>
+          <w:rFonts w:ascii="Arial" w:hAnsi="Arial" w:eastAsia="Arial" w:cs="Arial"/>
+          <w:spacing w:val="-12"/>
+          <w:sz w:val="28"/>
+          <w:szCs w:val="28"/>
+        </w:rPr>
+        <w:t xml:space="preserve"> </w:t>
+      </w:r>
+      <w:r>
+        <w:rPr>
+          <w:rFonts w:ascii="Arial" w:hAnsi="Arial" w:eastAsia="Arial" w:cs="Arial"/>
+          <w:b/>
+          <w:bCs/>
+          <w:spacing w:val="-7"/>
+          <w:sz w:val="28"/>
+          <w:szCs w:val="28"/>
+        </w:rPr>
         <w:t>English</w:t>
       </w:r>
     </w:p>
-    <w:p>
-      <w:bookmarkStart w:id="0" w:name="_GoBack"/>
-      <w:bookmarkEnd w:id="0"/>
-    </w:p>
+    <w:p/>
     <w:p>
       <w:pPr>
         <w:spacing w:line="177" w:lineRule="exact"/>

</xml_diff>